<commit_message>
Word: una tabla de una sola columna es un marco y se lee como texto corrido
Muchos maquetadores ponen cada figura con su leyenda (y los recuadros) en una
tabla de una columna; el importador las tomaba como tablas y perdía la imagen.
Con el DOCX real de Hechos, inferencias e incertidumbre entran ahora las 15
figuras con su leyenda y quedan sólo las 4 tablas de verdad. La muestra Word de
las pruebas pone su figura en un marco así.

Co-Authored-By: Claude Opus 5.5 <noreply@anthropic.com>
Claude-Session: https://claude.ai/code/session_01SPkhDdVzUCxJwqq61ddeLW
</commit_message>
<xml_diff>
--- a/tests/fixtures/ejemplo.docx
+++ b/tests/fixtures/ejemplo.docx
@@ -181,28 +181,34 @@
         </w:tc>
       </w:tr>
     </w:tbl>
-    <w:p>
-      <w:r>
-        <w:drawing>
-          <wp:inline>
-            <wp:docPr id="1" name="Imagen 1"/>
-            <a:graphic>
-              <a:graphicData>
-                <a:blip r:embed="rId5"/>
-              </a:graphicData>
-            </a:graphic>
-          </wp:inline>
-        </w:drawing>
-      </w:r>
-    </w:p>
-    <w:p>
-      <w:pPr>
-        <w:pStyle w:val="Descripcin"/>
-      </w:pPr>
-      <w:r>
-        <w:t xml:space="preserve">Figura 1. Un punto mínimo.</w:t>
-      </w:r>
-    </w:p>
+    <w:tbl>
+      <w:tr>
+        <w:tc>
+          <w:p>
+            <w:r>
+              <w:drawing>
+                <wp:inline>
+                  <wp:docPr id="1" name="Imagen 1"/>
+                  <a:graphic>
+                    <a:graphicData>
+                      <a:blip r:embed="rId5"/>
+                    </a:graphicData>
+                  </a:graphic>
+                </wp:inline>
+              </w:drawing>
+            </w:r>
+          </w:p>
+          <w:p>
+            <w:pPr>
+              <w:pStyle w:val="Descripcin"/>
+            </w:pPr>
+            <w:r>
+              <w:t xml:space="preserve">Figura 1. Un punto mínimo.</w:t>
+            </w:r>
+          </w:p>
+        </w:tc>
+      </w:tr>
+    </w:tbl>
     <w:p/>
     <w:p>
       <w:pPr>

</xml_diff>